<commit_message>
Part 4: add episode 47 (Inauguration)
Co-Authored-By: Claude Sonnet 5.5 <noreply@anthropic.com>
Claude-Session: https://claude.ai/code/session_016yuGLRgHQJz1ZWi5RCZoZ6
</commit_message>
<xml_diff>
--- a/part4/ep46_Le_toast_de_Gaston.docx
+++ b/part4/ep46_Le_toast_de_Gaston.docx
@@ -574,7 +574,7 @@
           <w:sz w:val="22"/>
         </w:rPr>
         <w:tab/>
-        <w:t>Oui, de Didier Marchais. Il vient samedi prochain avec sa vendange de quatre-vingt-dix.</w:t>
+        <w:t>Oui, de Didier Marchais. Il vient demain avec sa vendange de quatre-vingt-dix.</w:t>
       </w:r>
     </w:p>
     <w:p>
@@ -5713,7 +5713,7 @@
           <w:sz w:val="21"/>
         </w:rPr>
         <w:tab/>
-        <w:t>네, 디디에 마르셰의 것이에요. 다음 토요일에 1990년 수확을 들고 올 거예요.</w:t>
+        <w:t>네, 디디에 마르셰의 것이에요. 내일 1990년 수확을 들고 올 거예요.</w:t>
       </w:r>
     </w:p>
     <w:p>

</xml_diff>